<commit_message>
Phase 2 pipeline complete
- Replaced legacy Phase 1 model (plants, uses, preparations)
- Introduced seed_plants as single source of truth
- Implemented SharePoint ingestion (Stage 03)
- Added PFAF enrichment with caching (Stage 20)
- Added structured parsing layer (Stage 21)
- Created plant_card_view for BI consumption (Stage 30)
- Implemented validation layer (Stage 29)
- Standardised DB connection via setup script
- Resolved table/view conflicts in DuckDB
- Removed legacy enrichment scripts (USDA, Algolia, Wikipedia)

Pipeline now fully reproducible and Power BI ready
</commit_message>
<xml_diff>
--- a/docs/01_GreenThumb_ProjectSummary.docx
+++ b/docs/01_GreenThumb_ProjectSummary.docx
@@ -39,20 +39,6 @@
         <w:rPr>
           <w:sz w:val="22"/>
         </w:rPr>
-        <w:t>Document type: functional data specification</w:t>
-      </w:r>
-      <w:r>
-        <w:rPr>
-          <w:sz w:val="22"/>
-        </w:rPr>
-        <w:br/>
-        <w:t>Scope: Phase 1 baseline schema, sources and operating assumptions</w:t>
-      </w:r>
-      <w:r>
-        <w:rPr>
-          <w:sz w:val="22"/>
-        </w:rPr>
-        <w:br/>
         <w:t>Context: Ker‑Huella, Morlaix, Brittany, France</w:t>
       </w:r>
     </w:p>
@@ -73,7 +59,21 @@
           <w:i/>
           <w:sz w:val="18"/>
         </w:rPr>
-        <w:t>Status note: This document defines a proposed Phase 1 baseline specification designed for data curation, dashboards, analysis and garden operations. It is not a medical advice document, and it deliberately avoids dosage guidance or personalised recommendations.</w:t>
+        <w:t xml:space="preserve">Status note: This document defines a proposed </w:t>
+      </w:r>
+      <w:r>
+        <w:rPr>
+          <w:i/>
+          <w:sz w:val="18"/>
+        </w:rPr>
+        <w:t>plant database</w:t>
+      </w:r>
+      <w:r>
+        <w:rPr>
+          <w:i/>
+          <w:sz w:val="18"/>
+        </w:rPr>
+        <w:t xml:space="preserve"> designed for data curation, dashboards, analysis and garden operations. It is not a medical advice document, and it deliberately avoids dosage guidance or personalised recommendations.</w:t>
       </w:r>
     </w:p>
     <w:p>
@@ -110,7 +110,10 @@
     </w:p>
     <w:p>
       <w:r>
-        <w:t xml:space="preserve">Phase 1 supports four practical use cases: </w:t>
+        <w:t>The project</w:t>
+      </w:r>
+      <w:r>
+        <w:t xml:space="preserve"> supports four practical use cases: </w:t>
       </w:r>
     </w:p>
     <w:p>
@@ -151,7 +154,10 @@
         </w:numPr>
       </w:pPr>
       <w:r>
-        <w:t xml:space="preserve">garden management for what is planted where, what needs attention and when parts are usually harvested; and </w:t>
+        <w:t>G</w:t>
+      </w:r>
+      <w:r>
+        <w:t xml:space="preserve">arden management for what is planted where, what needs attention and when parts are usually harvested; and </w:t>
       </w:r>
     </w:p>
     <w:p>
@@ -292,14 +298,7 @@
               <w:rPr>
                 <w:sz w:val="18"/>
               </w:rPr>
-              <w:t xml:space="preserve">Public web interface; browse/search by scientific name, common name or compound. No official public Phase 1 API endpoint was identified in the retrieved source, so ingestion should be treated </w:t>
-            </w:r>
-            <w:r>
-              <w:rPr>
-                <w:sz w:val="18"/>
-              </w:rPr>
-              <w:lastRenderedPageBreak/>
-              <w:t>as manual lookup or carefully governed scraping only if terms permit. URL: https://plantaedb.com/</w:t>
+              <w:t>Public web interface; browse/search by scientific name, common name or compound. No official public Phase 1 API endpoint was identified in the retrieved source, so ingestion should be treated as manual lookup or carefully governed scraping only if terms permit. URL: https://plantaedb.com/</w:t>
             </w:r>
           </w:p>
         </w:tc>
@@ -698,7 +697,6 @@
         <w:pStyle w:val="Heading2"/>
       </w:pPr>
       <w:r>
-        <w:lastRenderedPageBreak/>
         <w:t>Edible Plant Database</w:t>
       </w:r>
     </w:p>
@@ -748,7 +746,14 @@
               <w:rPr>
                 <w:sz w:val="18"/>
               </w:rPr>
-              <w:t>Structured edible plant platform with species pages and a documented REST API. The content states data are sourced from Food Plants International and enriched with community summaries/images.</w:t>
+              <w:t xml:space="preserve">Structured edible plant platform with species pages and a documented REST API. The content states data are sourced from </w:t>
+            </w:r>
+            <w:r>
+              <w:rPr>
+                <w:sz w:val="18"/>
+              </w:rPr>
+              <w:lastRenderedPageBreak/>
+              <w:t>Food Plants International and enriched with community summaries/images.</w:t>
             </w:r>
           </w:p>
         </w:tc>
@@ -768,6 +773,7 @@
                 <w:b/>
                 <w:sz w:val="18"/>
               </w:rPr>
+              <w:lastRenderedPageBreak/>
               <w:t>Access method</w:t>
             </w:r>
           </w:p>
@@ -1154,7 +1160,6 @@
                 <w:b/>
                 <w:sz w:val="18"/>
               </w:rPr>
-              <w:lastRenderedPageBreak/>
               <w:t>Relevance to the project</w:t>
             </w:r>
           </w:p>
@@ -1180,6 +1185,7 @@
         <w:pStyle w:val="Heading2"/>
       </w:pPr>
       <w:r>
+        <w:lastRenderedPageBreak/>
         <w:t>PubMed</w:t>
       </w:r>
     </w:p>
@@ -1635,7 +1641,6 @@
                 <w:b/>
                 <w:sz w:val="18"/>
               </w:rPr>
-              <w:lastRenderedPageBreak/>
               <w:t>Relevance to the project</w:t>
             </w:r>
           </w:p>
@@ -1661,6 +1666,7 @@
         <w:pStyle w:val="Heading1"/>
       </w:pPr>
       <w:r>
+        <w:lastRenderedPageBreak/>
         <w:t>3. Internal Data Model (Phase 1)</w:t>
       </w:r>
     </w:p>
@@ -2690,7 +2696,6 @@
               <w:rPr>
                 <w:sz w:val="17"/>
               </w:rPr>
-              <w:lastRenderedPageBreak/>
               <w:t>PlantType</w:t>
             </w:r>
           </w:p>
@@ -2817,6 +2822,7 @@
               <w:rPr>
                 <w:sz w:val="17"/>
               </w:rPr>
+              <w:lastRenderedPageBreak/>
               <w:t>NativeRangeSummary</w:t>
             </w:r>
           </w:p>
@@ -3853,7 +3859,6 @@
               <w:rPr>
                 <w:sz w:val="17"/>
               </w:rPr>
-              <w:lastRenderedPageBreak/>
               <w:t>CreatedAt</w:t>
             </w:r>
           </w:p>
@@ -3974,6 +3979,7 @@
         <w:pStyle w:val="Heading2"/>
       </w:pPr>
       <w:r>
+        <w:lastRenderedPageBreak/>
         <w:t>3.2 PlantParts table</w:t>
       </w:r>
     </w:p>
@@ -4994,7 +5000,6 @@
               <w:rPr>
                 <w:sz w:val="17"/>
               </w:rPr>
-              <w:lastRenderedPageBreak/>
               <w:t>CreatedAt</w:t>
             </w:r>
           </w:p>
@@ -5115,6 +5120,7 @@
         <w:pStyle w:val="Heading2"/>
       </w:pPr>
       <w:r>
+        <w:lastRenderedPageBreak/>
         <w:t>3.3 Uses table</w:t>
       </w:r>
     </w:p>
@@ -6128,7 +6134,6 @@
               <w:rPr>
                 <w:sz w:val="17"/>
               </w:rPr>
-              <w:lastRenderedPageBreak/>
               <w:t>UpdatedAt</w:t>
             </w:r>
           </w:p>
@@ -6186,6 +6191,7 @@
         <w:pStyle w:val="Heading2"/>
       </w:pPr>
       <w:r>
+        <w:lastRenderedPageBreak/>
         <w:t>3.4 Preparations table</w:t>
       </w:r>
     </w:p>
@@ -7240,7 +7246,6 @@
               <w:rPr>
                 <w:sz w:val="17"/>
               </w:rPr>
-              <w:lastRenderedPageBreak/>
               <w:t>LocationName</w:t>
             </w:r>
           </w:p>
@@ -7374,6 +7379,7 @@
               <w:rPr>
                 <w:sz w:val="17"/>
               </w:rPr>
+              <w:lastRenderedPageBreak/>
               <w:t>LocationType</w:t>
             </w:r>
           </w:p>
@@ -8437,7 +8443,6 @@
               <w:rPr>
                 <w:sz w:val="17"/>
               </w:rPr>
-              <w:lastRenderedPageBreak/>
               <w:t>PlantLocationID</w:t>
             </w:r>
           </w:p>
@@ -8571,6 +8576,7 @@
               <w:rPr>
                 <w:sz w:val="17"/>
               </w:rPr>
+              <w:lastRenderedPageBreak/>
               <w:t>LocationID</w:t>
             </w:r>
           </w:p>

</xml_diff>